<commit_message>
docs(postman): consolidate docs and postman
- Consolidate documentation sources and compiled doc\n- Add Postman collection + environment\n- Update TASKS with IA context and conventions
</commit_message>
<xml_diff>
--- a/Documentation Copy/eShopy_Documento_10_Contratos_OpenAPI_v1.0.docx
+++ b/Documentation Copy/eShopy_Documento_10_Contratos_OpenAPI_v1.0.docx
@@ -1,6 +1,6 @@
 
 <file path=word/document.xml><?xml version="1.0" encoding="utf-8"?>
-<w:document xmlns:wpc="http://schemas.microsoft.com/office/word/2010/wordprocessingCanvas" xmlns:mo="http://schemas.microsoft.com/office/mac/office/2008/main" xmlns:mc="http://schemas.openxmlformats.org/markup-compatibility/2006" xmlns:mv="urn:schemas-microsoft-com:mac:vml" xmlns:o="urn:schemas-microsoft-com:office:office" xmlns:r="http://schemas.openxmlformats.org/officeDocument/2006/relationships" xmlns:m="http://schemas.openxmlformats.org/officeDocument/2006/math" xmlns:v="urn:schemas-microsoft-com:vml" xmlns:wp14="http://schemas.microsoft.com/office/word/2010/wordprocessingDrawing" xmlns:wp="http://schemas.openxmlformats.org/drawingml/2006/wordprocessingDrawing" xmlns:w10="urn:schemas-microsoft-com:office:word" xmlns:w="http://schemas.openxmlformats.org/wordprocessingml/2006/main" xmlns:w14="http://schemas.microsoft.com/office/word/2010/wordml" xmlns:wpg="http://schemas.microsoft.com/office/word/2010/wordprocessingGroup" xmlns:wpi="http://schemas.microsoft.com/office/word/2010/wordprocessingInk" xmlns:wne="http://schemas.microsoft.com/office/word/2006/wordml" xmlns:wps="http://schemas.microsoft.com/office/word/2010/wordprocessingShape" mc:Ignorable="w14 wp14">
+<w:document xmlns:ns1="http://schemas.openxmlformats.org/markup-compatibility/2006" xmlns:w="http://schemas.openxmlformats.org/wordprocessingml/2006/main" ns1:Ignorable="w14 wp14">
   <w:body>
     <w:p>
       <w:pPr>
@@ -304,29 +304,7 @@
     </w:p>
     <w:p>
       <w:r>
-        <w:t>{</w:t>
-        <w:br/>
-        <w:t xml:space="preserve">  "id": "uuid",</w:t>
-        <w:br/>
-        <w:t xml:space="preserve">  "slug": "string",</w:t>
-        <w:br/>
-        <w:t xml:space="preserve">  "name": "string",</w:t>
-        <w:br/>
-        <w:t xml:space="preserve">  "description": "string|null",</w:t>
-        <w:br/>
-        <w:t xml:space="preserve">  "price": 0.0,</w:t>
-        <w:br/>
-        <w:t xml:space="preserve">  "currencyCode": "PYG",</w:t>
-        <w:br/>
-        <w:t xml:space="preserve">  "status": "Draft",</w:t>
-        <w:br/>
-        <w:t xml:space="preserve">  "stockOnHand": 0,</w:t>
-        <w:br/>
-        <w:t xml:space="preserve">  "createdAtUtc": "2026-02-05T19:00:00Z",</w:t>
-        <w:br/>
-        <w:t xml:space="preserve">  "updatedAtUtc": "2026-02-05T19:00:00Z"</w:t>
-        <w:br/>
-        <w:t>}</w:t>
+        <w:t>{  "id": "uuid",  "slug": "string",  "sku": "string|null",  "name": "string",  "description": "string|null",  "price": 0.0,  "currencyCode": "PYG",  "status": "Draft",  "stockOnHand": 0,  "createdAtUtc": "2026-02-05T19:00:00Z",  "updatedAtUtc": "2026-02-05T19:00:00Z"}</w:t>
       </w:r>
     </w:p>
     <w:p>
@@ -336,19 +314,7 @@
     </w:p>
     <w:p>
       <w:r>
-        <w:t>{</w:t>
-        <w:br/>
-        <w:t xml:space="preserve">  "slug": "string",</w:t>
-        <w:br/>
-        <w:t xml:space="preserve">  "name": "string",</w:t>
-        <w:br/>
-        <w:t xml:space="preserve">  "description": "string|null",</w:t>
-        <w:br/>
-        <w:t xml:space="preserve">  "price": 0.0,</w:t>
-        <w:br/>
-        <w:t xml:space="preserve">  "stockOnHand": 0</w:t>
-        <w:br/>
-        <w:t>}</w:t>
+        <w:t>{  "slug": "string",  "sku": "string|null",  "name": "string",  "description": "string|null",  "price": 0.0,  "stockOnHand": 0}</w:t>
       </w:r>
     </w:p>
     <w:p>
@@ -358,17 +324,7 @@
     </w:p>
     <w:p>
       <w:r>
-        <w:t>{</w:t>
-        <w:br/>
-        <w:t xml:space="preserve">  "name": "string",</w:t>
-        <w:br/>
-        <w:t xml:space="preserve">  "description": "string|null",</w:t>
-        <w:br/>
-        <w:t xml:space="preserve">  "price": 0.0,</w:t>
-        <w:br/>
-        <w:t xml:space="preserve">  "stockOnHand": 0</w:t>
-        <w:br/>
-        <w:t>}</w:t>
+        <w:t>{  "name": "string",  "description": "string|null",  "price": 0.0,  "stockOnHand": 0,  "sku": "string|null"}</w:t>
       </w:r>
     </w:p>
     <w:p>
@@ -1027,7 +983,7 @@
     </w:p>
     <w:p>
       <w:r>
-        <w:t>- 409 ORDER_INVALID_STATE/CONFLICT</w:t>
+        <w:t>- 409 PRODUCT_INVALID_STATE/CONFLICT</w:t>
       </w:r>
     </w:p>
     <w:p>
@@ -1557,6 +1513,11 @@
       <w:cols w:space="720"/>
       <w:docGrid w:linePitch="360"/>
     </w:sectPr>
+    <w:p>
+      <w:r>
+        <w:t>Nota de consistencia: Sku es opcional y solo se valida/usa cuando esta presente.</w:t>
+      </w:r>
+    </w:p>
   </w:body>
 </w:document>
 </file>

</xml_diff>